<commit_message>
Clarify held-out RMSE comparisons
</commit_message>
<xml_diff>
--- a/docs/Evo2_regulatory_interactions_proposal_and_MVP.docx
+++ b/docs/Evo2_regulatory_interactions_proposal_and_MVP.docx
@@ -742,6 +742,11 @@
     <w:p>
       <w:r>
         <w:t>This question is about the numerical size of the interaction, not only its rank. Evo produces a raw interaction score in log-likelihood units, while the experiment reports epsilon in log2-activity units. We therefore fit a straight line that converts the Evo score into a predicted epsilon. The line is fitted using training pairs’ Evo scores and measured epsilons, then applied to a held-out fold. This is out-of-fold calibration: each pair is predicted by a line that never used that pair or its overlapping region.</w:t>
+      </w:r>
+    </w:p>
+    <w:p>
+      <w:r>
+        <w:t>A fold is simply one part of the dataset. In each of five rounds, four-fifths of the genomic groups are the training data and the remaining one-fifth is the held-out data. We learn the line from the training groups, use it to predict the held-out groups, and then move to the next round. At the end, every pair has one prediction made without using its own group’s measurement.</w:t>
       </w:r>
     </w:p>
     <w:p>
@@ -1686,6 +1691,11 @@
     <w:p>
       <w:r>
         <w:t>Read the table from left to right. Each row names a different way to produce a number for a pair. Every number is then compared with that pair’s measured epsilon. Correlations describe whether predictions and measurements move together; RMSE describes how far numerical predictions are from measurements. The calibrated Evo row is the main predictive test. The zero and training-mean rows show how hard it is to improve over simple constant guesses.</w:t>
+      </w:r>
+    </w:p>
+    <w:p>
+      <w:r>
+        <w:t>Across all 2,833 held-out predictions, calibrated Evo has RMSE 0.35427, while the zero-interaction reference has RMSE 0.35376. The difference is 0.00051 log2-activity units, with Evo slightly worse. The same ordering occurs in all five held-out folds, and the paired cluster-bootstrap interval for zero-reference RMSE minus Evo RMSE is −0.00083 to −0.00024. Thus this run provides no positive RMSE gain for Evo; the practical difference is very small.</w:t>
       </w:r>
     </w:p>
     <w:p>

</xml_diff>